<commit_message>
Przegląd bezpieczeństwa: funkcje z sekretami tylko dla serwera, limity prób w bazie, CSP, retencja danych; strony prawne; dokumenty RODO; poradnik zaktualizowany
Co-Authored-By: Claude Opus 5.5 <noreply@anthropic.com>
Claude-Session: https://claude.ai/code/session_01CLtcebTdiTD95Zxw3a2jtX
</commit_message>
<xml_diff>
--- a/docs/poradnik/Ostoja-poradnik-wersji-testowej.docx
+++ b/docs/poradnik/Ostoja-poradnik-wersji-testowej.docx
@@ -72,7 +72,7 @@
           <w:sz w:val="23"/>
           <w:szCs w:val="23"/>
         </w:rPr>
-        <w:t xml:space="preserve">Jak postawić wersję testową, zalogować się, przejść scenariusze z zakładem i zgłosić uwagi. Stan na 15 października 2026.</w:t>
+        <w:t xml:space="preserve">Jak postawić wersję testową, zalogować się, przejść scenariusze z zakładem i zgłosić uwagi. Stan na 16 października 2026.</w:t>
       </w:r>
     </w:p>
     <w:p>
@@ -1102,6 +1102,166 @@
                 <w:sz w:val="19"/>
                 <w:szCs w:val="19"/>
               </w:rPr>
+              <w:t xml:space="preserve">Panel administratora</w:t>
+            </w:r>
+          </w:p>
+        </w:tc>
+        <w:tc>
+          <w:tcPr>
+            <w:tcW w:type="dxa" w:w="4738"/>
+            <w:tcMar>
+              <w:top w:type="dxa" w:w="70"/>
+              <w:left w:type="dxa" w:w="100"/>
+              <w:bottom w:type="dxa" w:w="70"/>
+              <w:right w:type="dxa" w:w="100"/>
+            </w:tcMar>
+          </w:tcPr>
+          <w:p>
+            <w:pPr>
+              <w:spacing w:after="40" w:line="260"/>
+            </w:pPr>
+            <w:r>
+              <w:rPr>
+                <w:rFonts w:ascii="Arial" w:cs="Arial" w:eastAsia="Arial" w:hAnsi="Arial"/>
+                <w:color w:val="1E2422"/>
+                <w:sz w:val="19"/>
+                <w:szCs w:val="19"/>
+              </w:rPr>
+              <w:t xml:space="preserve">[adres]/admin</w:t>
+            </w:r>
+          </w:p>
+        </w:tc>
+        <w:tc>
+          <w:tcPr>
+            <w:tcW w:type="dxa" w:w="2300"/>
+            <w:tcMar>
+              <w:top w:type="dxa" w:w="70"/>
+              <w:left w:type="dxa" w:w="100"/>
+              <w:bottom w:type="dxa" w:w="70"/>
+              <w:right w:type="dxa" w:w="100"/>
+            </w:tcMar>
+          </w:tcPr>
+          <w:p>
+            <w:pPr>
+              <w:spacing w:after="40" w:line="260"/>
+            </w:pPr>
+            <w:r>
+              <w:rPr>
+                <w:rFonts w:ascii="Arial" w:cs="Arial" w:eastAsia="Arial" w:hAnsi="Arial"/>
+                <w:color w:val="1E2422"/>
+                <w:sz w:val="19"/>
+                <w:szCs w:val="19"/>
+              </w:rPr>
+              <w:t xml:space="preserve">opiekunowie Ostoi</w:t>
+            </w:r>
+          </w:p>
+        </w:tc>
+      </w:tr>
+      <w:tr>
+        <w:trPr>
+          <w:cantSplit/>
+        </w:trPr>
+        <w:tc>
+          <w:tcPr>
+            <w:tcW w:type="dxa" w:w="2600"/>
+            <w:tcMar>
+              <w:top w:type="dxa" w:w="70"/>
+              <w:left w:type="dxa" w:w="100"/>
+              <w:bottom w:type="dxa" w:w="70"/>
+              <w:right w:type="dxa" w:w="100"/>
+            </w:tcMar>
+          </w:tcPr>
+          <w:p>
+            <w:pPr>
+              <w:spacing w:after="40" w:line="260"/>
+            </w:pPr>
+            <w:r>
+              <w:rPr>
+                <w:rFonts w:ascii="Arial" w:cs="Arial" w:eastAsia="Arial" w:hAnsi="Arial"/>
+                <w:color w:val="1E2422"/>
+                <w:sz w:val="19"/>
+                <w:szCs w:val="19"/>
+              </w:rPr>
+              <w:t xml:space="preserve">Polityka prywatności, regulamin</w:t>
+            </w:r>
+          </w:p>
+        </w:tc>
+        <w:tc>
+          <w:tcPr>
+            <w:tcW w:type="dxa" w:w="4738"/>
+            <w:tcMar>
+              <w:top w:type="dxa" w:w="70"/>
+              <w:left w:type="dxa" w:w="100"/>
+              <w:bottom w:type="dxa" w:w="70"/>
+              <w:right w:type="dxa" w:w="100"/>
+            </w:tcMar>
+          </w:tcPr>
+          <w:p>
+            <w:pPr>
+              <w:spacing w:after="40" w:line="260"/>
+            </w:pPr>
+            <w:r>
+              <w:rPr>
+                <w:rFonts w:ascii="Arial" w:cs="Arial" w:eastAsia="Arial" w:hAnsi="Arial"/>
+                <w:color w:val="1E2422"/>
+                <w:sz w:val="19"/>
+                <w:szCs w:val="19"/>
+              </w:rPr>
+              <w:t xml:space="preserve">[adres]/prywatnosc, [adres]/regulamin</w:t>
+            </w:r>
+          </w:p>
+        </w:tc>
+        <w:tc>
+          <w:tcPr>
+            <w:tcW w:type="dxa" w:w="2300"/>
+            <w:tcMar>
+              <w:top w:type="dxa" w:w="70"/>
+              <w:left w:type="dxa" w:w="100"/>
+              <w:bottom w:type="dxa" w:w="70"/>
+              <w:right w:type="dxa" w:w="100"/>
+            </w:tcMar>
+          </w:tcPr>
+          <w:p>
+            <w:pPr>
+              <w:spacing w:after="40" w:line="260"/>
+            </w:pPr>
+            <w:r>
+              <w:rPr>
+                <w:rFonts w:ascii="Arial" w:cs="Arial" w:eastAsia="Arial" w:hAnsi="Arial"/>
+                <w:color w:val="1E2422"/>
+                <w:sz w:val="19"/>
+                <w:szCs w:val="19"/>
+              </w:rPr>
+              <w:t xml:space="preserve">wszyscy</w:t>
+            </w:r>
+          </w:p>
+        </w:tc>
+      </w:tr>
+      <w:tr>
+        <w:trPr>
+          <w:cantSplit/>
+        </w:trPr>
+        <w:tc>
+          <w:tcPr>
+            <w:tcW w:type="dxa" w:w="2600"/>
+            <w:tcMar>
+              <w:top w:type="dxa" w:w="70"/>
+              <w:left w:type="dxa" w:w="100"/>
+              <w:bottom w:type="dxa" w:w="70"/>
+              <w:right w:type="dxa" w:w="100"/>
+            </w:tcMar>
+          </w:tcPr>
+          <w:p>
+            <w:pPr>
+              <w:spacing w:after="40" w:line="260"/>
+            </w:pPr>
+            <w:r>
+              <w:rPr>
+                <w:rFonts w:ascii="Arial" w:cs="Arial" w:eastAsia="Arial" w:hAnsi="Arial"/>
+                <w:color w:val="1E2422"/>
+                <w:sz w:val="19"/>
+                <w:szCs w:val="19"/>
+              </w:rPr>
               <w:t xml:space="preserve">System wizualny</w:t>
             </w:r>
           </w:p>
@@ -2275,6 +2435,61 @@
                 <w:szCs w:val="19"/>
               </w:rPr>
               <w:t xml:space="preserve">z kroku 3.1.6</w:t>
+            </w:r>
+          </w:p>
+        </w:tc>
+      </w:tr>
+      <w:tr>
+        <w:trPr>
+          <w:cantSplit/>
+        </w:trPr>
+        <w:tc>
+          <w:tcPr>
+            <w:tcW w:type="dxa" w:w="3900"/>
+            <w:tcMar>
+              <w:top w:type="dxa" w:w="70"/>
+              <w:left w:type="dxa" w:w="100"/>
+              <w:bottom w:type="dxa" w:w="70"/>
+              <w:right w:type="dxa" w:w="100"/>
+            </w:tcMar>
+          </w:tcPr>
+          <w:p>
+            <w:pPr>
+              <w:spacing w:after="40" w:line="260"/>
+            </w:pPr>
+            <w:r>
+              <w:rPr>
+                <w:rFonts w:ascii="Arial" w:cs="Arial" w:eastAsia="Arial" w:hAnsi="Arial"/>
+                <w:color w:val="1E2422"/>
+                <w:sz w:val="19"/>
+                <w:szCs w:val="19"/>
+              </w:rPr>
+              <w:t xml:space="preserve">SUPABASE_SERVICE_ROLE_KEY</w:t>
+            </w:r>
+          </w:p>
+        </w:tc>
+        <w:tc>
+          <w:tcPr>
+            <w:tcW w:type="dxa" w:w="5738"/>
+            <w:tcMar>
+              <w:top w:type="dxa" w:w="70"/>
+              <w:left w:type="dxa" w:w="100"/>
+              <w:bottom w:type="dxa" w:w="70"/>
+              <w:right w:type="dxa" w:w="100"/>
+            </w:tcMar>
+          </w:tcPr>
+          <w:p>
+            <w:pPr>
+              <w:spacing w:after="40" w:line="260"/>
+            </w:pPr>
+            <w:r>
+              <w:rPr>
+                <w:rFonts w:ascii="Arial" w:cs="Arial" w:eastAsia="Arial" w:hAnsi="Arial"/>
+                <w:color w:val="1E2422"/>
+                <w:sz w:val="19"/>
+                <w:szCs w:val="19"/>
+              </w:rPr>
+              <w:t xml:space="preserve">Project Settings, API, klucz service_role – tylko w Vercel, nigdy w zmiennych NEXT_PUBLIC_; potrzebny do zakładania kont zaproszonych osób</w:t>
             </w:r>
           </w:p>
         </w:tc>
@@ -3467,6 +3682,111 @@
           </w:p>
         </w:tc>
       </w:tr>
+      <w:tr>
+        <w:trPr>
+          <w:cantSplit/>
+        </w:trPr>
+        <w:tc>
+          <w:tcPr>
+            <w:tcW w:type="dxa" w:w="2300"/>
+            <w:tcMar>
+              <w:top w:type="dxa" w:w="70"/>
+              <w:left w:type="dxa" w:w="100"/>
+              <w:bottom w:type="dxa" w:w="70"/>
+              <w:right w:type="dxa" w:w="100"/>
+            </w:tcMar>
+          </w:tcPr>
+          <w:p>
+            <w:pPr>
+              <w:spacing w:after="40" w:line="260"/>
+            </w:pPr>
+            <w:r>
+              <w:rPr>
+                <w:rFonts w:ascii="Arial" w:cs="Arial" w:eastAsia="Arial" w:hAnsi="Arial"/>
+                <w:color w:val="1E2422"/>
+                <w:sz w:val="19"/>
+                <w:szCs w:val="19"/>
+              </w:rPr>
+              <w:t xml:space="preserve">Ola Maj</w:t>
+            </w:r>
+          </w:p>
+        </w:tc>
+        <w:tc>
+          <w:tcPr>
+            <w:tcW w:type="dxa" w:w="2500"/>
+            <w:tcMar>
+              <w:top w:type="dxa" w:w="70"/>
+              <w:left w:type="dxa" w:w="100"/>
+              <w:bottom w:type="dxa" w:w="70"/>
+              <w:right w:type="dxa" w:w="100"/>
+            </w:tcMar>
+          </w:tcPr>
+          <w:p>
+            <w:pPr>
+              <w:spacing w:after="40" w:line="260"/>
+            </w:pPr>
+            <w:r>
+              <w:rPr>
+                <w:rFonts w:ascii="Arial" w:cs="Arial" w:eastAsia="Arial" w:hAnsi="Arial"/>
+                <w:color w:val="1E2422"/>
+                <w:sz w:val="19"/>
+                <w:szCs w:val="19"/>
+              </w:rPr>
+              <w:t xml:space="preserve">ola@ostoja.test</w:t>
+            </w:r>
+          </w:p>
+        </w:tc>
+        <w:tc>
+          <w:tcPr>
+            <w:tcW w:type="dxa" w:w="3338"/>
+            <w:tcMar>
+              <w:top w:type="dxa" w:w="70"/>
+              <w:left w:type="dxa" w:w="100"/>
+              <w:bottom w:type="dxa" w:w="70"/>
+              <w:right w:type="dxa" w:w="100"/>
+            </w:tcMar>
+          </w:tcPr>
+          <w:p>
+            <w:pPr>
+              <w:spacing w:after="40" w:line="260"/>
+            </w:pPr>
+            <w:r>
+              <w:rPr>
+                <w:rFonts w:ascii="Arial" w:cs="Arial" w:eastAsia="Arial" w:hAnsi="Arial"/>
+                <w:color w:val="1E2422"/>
+                <w:sz w:val="19"/>
+                <w:szCs w:val="19"/>
+              </w:rPr>
+              <w:t xml:space="preserve">Ostoja (panel /admin)</w:t>
+            </w:r>
+          </w:p>
+        </w:tc>
+        <w:tc>
+          <w:tcPr>
+            <w:tcW w:type="dxa" w:w="1500"/>
+            <w:tcMar>
+              <w:top w:type="dxa" w:w="70"/>
+              <w:left w:type="dxa" w:w="100"/>
+              <w:bottom w:type="dxa" w:w="70"/>
+              <w:right w:type="dxa" w:w="100"/>
+            </w:tcMar>
+          </w:tcPr>
+          <w:p>
+            <w:pPr>
+              <w:spacing w:after="40" w:line="260"/>
+            </w:pPr>
+            <w:r>
+              <w:rPr>
+                <w:rFonts w:ascii="Arial" w:cs="Arial" w:eastAsia="Arial" w:hAnsi="Arial"/>
+                <w:color w:val="1E2422"/>
+                <w:sz w:val="19"/>
+                <w:szCs w:val="19"/>
+              </w:rPr>
+              <w:t xml:space="preserve">administrator</w:t>
+            </w:r>
+          </w:p>
+        </w:tc>
+      </w:tr>
     </w:tbl>
     <w:p>
       <w:pPr>
@@ -3520,7 +3840,7 @@
           <w:sz w:val="21"/>
           <w:szCs w:val="21"/>
         </w:rPr>
-        <w:t xml:space="preserve"> na stronie /logowanie kliknij osobę. Działa tylko przy DEMO_MODE=true.</w:t>
+        <w:t xml:space="preserve"> na stronie /logowanie kliknij osobę. Działa tylko przy DEMO_MODE=true i tylko dla adresów kończących się na .test – prawdziwe konta logują się zawsze linkiem z e-maila.</w:t>
       </w:r>
     </w:p>
     <w:p>
@@ -3536,142 +3856,16 @@
           <w:sz w:val="21"/>
           <w:szCs w:val="21"/>
         </w:rPr>
-        <w:t xml:space="preserve">Link z e-maila</w:t>
-      </w:r>
-      <w:r>
-        <w:rPr>
-          <w:rFonts w:ascii="Arial" w:cs="Arial" w:eastAsia="Arial" w:hAnsi="Arial"/>
-          <w:color w:val="1E2422"/>
-          <w:sz w:val="21"/>
-          <w:szCs w:val="21"/>
-        </w:rPr>
-        <w:t xml:space="preserve"> (pracownicy zakładów w pilocie):</w:t>
-      </w:r>
-    </w:p>
-    <w:p>
-      <w:pPr>
-        <w:pStyle w:val="ListParagraph"/>
-        <w:numPr>
-          <w:ilvl w:val="0"/>
-          <w:numId w:val="9"/>
-        </w:numPr>
-        <w:spacing w:after="90" w:line="290"/>
-      </w:pPr>
-      <w:r>
-        <w:rPr>
-          <w:rFonts w:ascii="Arial" w:cs="Arial" w:eastAsia="Arial" w:hAnsi="Arial"/>
-          <w:color w:val="1E2422"/>
-          <w:sz w:val="21"/>
-          <w:szCs w:val="21"/>
-        </w:rPr>
-        <w:t xml:space="preserve">Supabase, Authentication, Users, </w:t>
-      </w:r>
-      <w:r>
-        <w:rPr>
-          <w:rFonts w:ascii="Arial" w:cs="Arial" w:eastAsia="Arial" w:hAnsi="Arial"/>
-          <w:b/>
-          <w:bCs/>
-          <w:color w:val="1E2422"/>
-          <w:sz w:val="21"/>
-          <w:szCs w:val="21"/>
-        </w:rPr>
-        <w:t xml:space="preserve">Add user</w:t>
-      </w:r>
-      <w:r>
-        <w:rPr>
-          <w:rFonts w:ascii="Arial" w:cs="Arial" w:eastAsia="Arial" w:hAnsi="Arial"/>
-          <w:color w:val="1E2422"/>
-          <w:sz w:val="21"/>
-          <w:szCs w:val="21"/>
-        </w:rPr>
-        <w:t xml:space="preserve">, Create new user: służbowy e-mail pracownika, zaznacz </w:t>
-      </w:r>
-      <w:r>
-        <w:rPr>
-          <w:rFonts w:ascii="Arial" w:cs="Arial" w:eastAsia="Arial" w:hAnsi="Arial"/>
-          <w:b/>
-          <w:bCs/>
-          <w:color w:val="1E2422"/>
-          <w:sz w:val="21"/>
-          <w:szCs w:val="21"/>
-        </w:rPr>
-        <w:t xml:space="preserve">Auto Confirm User</w:t>
-      </w:r>
-      <w:r>
-        <w:rPr>
-          <w:rFonts w:ascii="Arial" w:cs="Arial" w:eastAsia="Arial" w:hAnsi="Arial"/>
-          <w:color w:val="1E2422"/>
-          <w:sz w:val="21"/>
-          <w:szCs w:val="21"/>
-        </w:rPr>
-        <w:t xml:space="preserve">.</w:t>
-      </w:r>
-    </w:p>
-    <w:p>
-      <w:pPr>
-        <w:pStyle w:val="ListParagraph"/>
-        <w:numPr>
-          <w:ilvl w:val="0"/>
-          <w:numId w:val="9"/>
-        </w:numPr>
-        <w:spacing w:after="90" w:line="290"/>
-      </w:pPr>
-      <w:r>
-        <w:rPr>
-          <w:rFonts w:ascii="Arial" w:cs="Arial" w:eastAsia="Arial" w:hAnsi="Arial"/>
-          <w:color w:val="1E2422"/>
-          <w:sz w:val="21"/>
-          <w:szCs w:val="21"/>
-        </w:rPr>
-        <w:t xml:space="preserve">Przypisz konto do zakładu w SQL Editor (podmień identyfikator zakładu z tabeli funeral_homes, rolę: wlasciciel, biuro albo ekipa, imię i nazwisko oraz e-mail):</w:t>
-      </w:r>
-    </w:p>
-    <w:p>
-      <w:pPr>
-        <w:shd w:fill="F4F4F2" w:color="auto" w:val="clear"/>
-        <w:spacing w:after="0" w:before="60"/>
-        <w:ind w:left="120" w:right="120"/>
-      </w:pPr>
-      <w:r>
-        <w:rPr>
-          <w:rFonts w:ascii="Consolas" w:cs="Consolas" w:eastAsia="Consolas" w:hAnsi="Consolas"/>
-          <w:color w:val="1E2422"/>
-          <w:sz w:val="19"/>
-          <w:szCs w:val="19"/>
-        </w:rPr>
-        <w:t xml:space="preserve">insert into memberships (user_id, home_id, role, display_name)</w:t>
-      </w:r>
-    </w:p>
-    <w:p>
-      <w:pPr>
-        <w:shd w:fill="F4F4F2" w:color="auto" w:val="clear"/>
-        <w:spacing w:after="0" w:before="0"/>
-        <w:ind w:left="120" w:right="120"/>
-      </w:pPr>
-      <w:r>
-        <w:rPr>
-          <w:rFonts w:ascii="Consolas" w:cs="Consolas" w:eastAsia="Consolas" w:hAnsi="Consolas"/>
-          <w:color w:val="1E2422"/>
-          <w:sz w:val="19"/>
-          <w:szCs w:val="19"/>
-        </w:rPr>
-        <w:t xml:space="preserve">select id, '[id zakładu]', 'wlasciciel', '[Imię Nazwisko]'</w:t>
-      </w:r>
-    </w:p>
-    <w:p>
-      <w:pPr>
-        <w:shd w:fill="F4F4F2" w:color="auto" w:val="clear"/>
-        <w:spacing w:after="140" w:before="0"/>
-        <w:ind w:left="120" w:right="120"/>
-      </w:pPr>
-      <w:r>
-        <w:rPr>
-          <w:rFonts w:ascii="Consolas" w:cs="Consolas" w:eastAsia="Consolas" w:hAnsi="Consolas"/>
-          <w:color w:val="1E2422"/>
-          <w:sz w:val="19"/>
-          <w:szCs w:val="19"/>
-        </w:rPr>
-        <w:t xml:space="preserve">from auth.users where email = '[e-mail]';</w:t>
+        <w:t xml:space="preserve">Nowy zakład</w:t>
+      </w:r>
+      <w:r>
+        <w:rPr>
+          <w:rFonts w:ascii="Arial" w:cs="Arial" w:eastAsia="Arial" w:hAnsi="Arial"/>
+          <w:color w:val="1E2422"/>
+          <w:sz w:val="21"/>
+          <w:szCs w:val="21"/>
+        </w:rPr>
+        <w:t xml:space="preserve"> dodaje administrator Ostoi w panelu /admin: Dodaj partnera, a na karcie zakładu Zaproś do panelu (rola Właściciel). Zakład pojawia się rodzinom dopiero po weryfikacji i z pełnym cennikiem.</w:t>
       </w:r>
     </w:p>
     <w:p>
@@ -3681,31 +3875,22 @@
       <w:r>
         <w:rPr>
           <w:rFonts w:ascii="Arial" w:cs="Arial" w:eastAsia="Arial" w:hAnsi="Arial"/>
-          <w:color w:val="1E2422"/>
-          <w:sz w:val="21"/>
-          <w:szCs w:val="21"/>
-        </w:rPr>
-        <w:t xml:space="preserve">Pracownik wchodzi na /logowanie, wpisuje e-mail i klika </w:t>
-      </w:r>
-      <w:r>
-        <w:rPr>
-          <w:rFonts w:ascii="Arial" w:cs="Arial" w:eastAsia="Arial" w:hAnsi="Arial"/>
           <w:b/>
           <w:bCs/>
           <w:color w:val="1E2422"/>
           <w:sz w:val="21"/>
           <w:szCs w:val="21"/>
         </w:rPr>
-        <w:t xml:space="preserve">Wyślij link</w:t>
-      </w:r>
-      <w:r>
-        <w:rPr>
-          <w:rFonts w:ascii="Arial" w:cs="Arial" w:eastAsia="Arial" w:hAnsi="Arial"/>
-          <w:color w:val="1E2422"/>
-          <w:sz w:val="21"/>
-          <w:szCs w:val="21"/>
-        </w:rPr>
-        <w:t xml:space="preserve">. W mailu klika </w:t>
+        <w:t xml:space="preserve">Pracowników zakładu</w:t>
+      </w:r>
+      <w:r>
+        <w:rPr>
+          <w:rFonts w:ascii="Arial" w:cs="Arial" w:eastAsia="Arial" w:hAnsi="Arial"/>
+          <w:color w:val="1E2422"/>
+          <w:sz w:val="21"/>
+          <w:szCs w:val="21"/>
+        </w:rPr>
+        <w:t xml:space="preserve"> zaprasza właściciel w panelu: Zespół, Utwórz zaproszenie. Link wysyła SMS-em albo e-mailem; działa 7 dni i raz. Osoba otwiera link, klika </w:t>
       </w:r>
       <w:r>
         <w:rPr>
@@ -3716,16 +3901,16 @@
           <w:sz w:val="21"/>
           <w:szCs w:val="21"/>
         </w:rPr>
-        <w:t xml:space="preserve">Zaloguj się do Ostoi</w:t>
-      </w:r>
-      <w:r>
-        <w:rPr>
-          <w:rFonts w:ascii="Arial" w:cs="Arial" w:eastAsia="Arial" w:hAnsi="Arial"/>
-          <w:color w:val="1E2422"/>
-          <w:sz w:val="21"/>
-          <w:szCs w:val="21"/>
-        </w:rPr>
-        <w:t xml:space="preserve">, a na stronie przycisk </w:t>
+        <w:t xml:space="preserve">Przyjmij zaproszenie</w:t>
+      </w:r>
+      <w:r>
+        <w:rPr>
+          <w:rFonts w:ascii="Arial" w:cs="Arial" w:eastAsia="Arial" w:hAnsi="Arial"/>
+          <w:color w:val="1E2422"/>
+          <w:sz w:val="21"/>
+          <w:szCs w:val="21"/>
+        </w:rPr>
+        <w:t xml:space="preserve">, a potem loguje się linkiem z e-maila: wpisuje e-mail na /logowanie, klika </w:t>
       </w:r>
       <w:r>
         <w:rPr>
@@ -3736,6 +3921,46 @@
           <w:sz w:val="21"/>
           <w:szCs w:val="21"/>
         </w:rPr>
+        <w:t xml:space="preserve">Wyślij link</w:t>
+      </w:r>
+      <w:r>
+        <w:rPr>
+          <w:rFonts w:ascii="Arial" w:cs="Arial" w:eastAsia="Arial" w:hAnsi="Arial"/>
+          <w:color w:val="1E2422"/>
+          <w:sz w:val="21"/>
+          <w:szCs w:val="21"/>
+        </w:rPr>
+        <w:t xml:space="preserve">, w mailu </w:t>
+      </w:r>
+      <w:r>
+        <w:rPr>
+          <w:rFonts w:ascii="Arial" w:cs="Arial" w:eastAsia="Arial" w:hAnsi="Arial"/>
+          <w:b/>
+          <w:bCs/>
+          <w:color w:val="1E2422"/>
+          <w:sz w:val="21"/>
+          <w:szCs w:val="21"/>
+        </w:rPr>
+        <w:t xml:space="preserve">Zaloguj się do Ostoi</w:t>
+      </w:r>
+      <w:r>
+        <w:rPr>
+          <w:rFonts w:ascii="Arial" w:cs="Arial" w:eastAsia="Arial" w:hAnsi="Arial"/>
+          <w:color w:val="1E2422"/>
+          <w:sz w:val="21"/>
+          <w:szCs w:val="21"/>
+        </w:rPr>
+        <w:t xml:space="preserve"> i na stronie </w:t>
+      </w:r>
+      <w:r>
+        <w:rPr>
+          <w:rFonts w:ascii="Arial" w:cs="Arial" w:eastAsia="Arial" w:hAnsi="Arial"/>
+          <w:b/>
+          <w:bCs/>
+          <w:color w:val="1E2422"/>
+          <w:sz w:val="21"/>
+          <w:szCs w:val="21"/>
+        </w:rPr>
         <w:t xml:space="preserve">Zaloguj się</w:t>
       </w:r>
       <w:r>
@@ -3745,7 +3970,21 @@
           <w:sz w:val="21"/>
           <w:szCs w:val="21"/>
         </w:rPr>
-        <w:t xml:space="preserve">. Link działa godzinę i tylko raz. Zapraszanie pracowników z panelu jest na liście następnych kroków.</w:t>
+        <w:t xml:space="preserve">. Link logowania działa godzinę i tylko raz.</w:t>
+      </w:r>
+    </w:p>
+    <w:p>
+      <w:pPr>
+        <w:spacing w:after="120" w:line="300"/>
+      </w:pPr>
+      <w:r>
+        <w:rPr>
+          <w:rFonts w:ascii="Arial" w:cs="Arial" w:eastAsia="Arial" w:hAnsi="Arial"/>
+          <w:color w:val="1E2422"/>
+          <w:sz w:val="21"/>
+          <w:szCs w:val="21"/>
+        </w:rPr>
+        <w:t xml:space="preserve">Zakładanie kont przy przyjęciu zaproszenia wymaga zmiennej SUPABASE_SERVICE_ROLE_KEY (krok 3.3). Bez Supabase (lokalnie) konto zakłada się samo i osoba od razu trafia do panelu.</w:t>
       </w:r>
     </w:p>
     <w:p>
@@ -4391,7 +4630,7 @@
                 <w:sz w:val="19"/>
                 <w:szCs w:val="19"/>
               </w:rPr>
-              <w:t xml:space="preserve">Wybierz ten zakład (Cisza) → wpisz fikcyjne dane, np. Jan Testowy, 600 100 200 → zaznacz zgodę → Poproś o kontakt.</w:t>
+              <w:t xml:space="preserve">Wybierz ten zakład (Cisza) → wpisz fikcyjne dane, np. Jan Testowy, 600 100 200 → zaznacz zgodę → Poproś o kontakt → wpisz kod z SMS-a (w wersji testowej kod jest na ekranie) → Potwierdź i wyślij zapytanie.</w:t>
             </w:r>
           </w:p>
         </w:tc>
@@ -4416,7 +4655,7 @@
                 <w:sz w:val="19"/>
                 <w:szCs w:val="19"/>
               </w:rPr>
-              <w:t xml:space="preserve">Ekran „Zapytanie wysłane” z nazwą zakładu i informacją o 15 minutach.</w:t>
+              <w:t xml:space="preserve">Ekran „Wpisz kod z SMS-a” z zamaskowanym numerem, potem „Zapytanie wysłane” z nazwą zakładu i informacją o 15 minutach.</w:t>
             </w:r>
           </w:p>
         </w:tc>
@@ -4498,7 +4737,7 @@
                 <w:sz w:val="19"/>
                 <w:szCs w:val="19"/>
               </w:rPr>
-              <w:t xml:space="preserve">Powtórz R1 i na dole listy kliknij Wyślij do 3 najbliższych → wyślij formularz.</w:t>
+              <w:t xml:space="preserve">Powtórz R1 i na dole listy kliknij Wyślij do 3 najbliższych → wyślij formularz → wpisz kod.</w:t>
             </w:r>
           </w:p>
         </w:tc>
@@ -5077,6 +5316,113 @@
                 <w:szCs w:val="19"/>
               </w:rPr>
               <w:t xml:space="preserve">Pasek „Brak połączenia z internetem…”.</w:t>
+            </w:r>
+          </w:p>
+        </w:tc>
+      </w:tr>
+      <w:tr>
+        <w:trPr>
+          <w:cantSplit/>
+        </w:trPr>
+        <w:tc>
+          <w:tcPr>
+            <w:tcW w:type="dxa" w:w="620"/>
+            <w:tcMar>
+              <w:top w:type="dxa" w:w="70"/>
+              <w:left w:type="dxa" w:w="100"/>
+              <w:bottom w:type="dxa" w:w="70"/>
+              <w:right w:type="dxa" w:w="100"/>
+            </w:tcMar>
+          </w:tcPr>
+          <w:p>
+            <w:pPr>
+              <w:spacing w:after="40" w:line="260"/>
+            </w:pPr>
+            <w:r>
+              <w:rPr>
+                <w:rFonts w:ascii="Arial" w:cs="Arial" w:eastAsia="Arial" w:hAnsi="Arial"/>
+                <w:color w:val="1E2422"/>
+                <w:sz w:val="19"/>
+                <w:szCs w:val="19"/>
+              </w:rPr>
+              <w:t xml:space="preserve">R11</w:t>
+            </w:r>
+          </w:p>
+        </w:tc>
+        <w:tc>
+          <w:tcPr>
+            <w:tcW w:type="dxa" w:w="1900"/>
+            <w:tcMar>
+              <w:top w:type="dxa" w:w="70"/>
+              <w:left w:type="dxa" w:w="100"/>
+              <w:bottom w:type="dxa" w:w="70"/>
+              <w:right w:type="dxa" w:w="100"/>
+            </w:tcMar>
+          </w:tcPr>
+          <w:p>
+            <w:pPr>
+              <w:spacing w:after="40" w:line="260"/>
+            </w:pPr>
+            <w:r>
+              <w:rPr>
+                <w:rFonts w:ascii="Arial" w:cs="Arial" w:eastAsia="Arial" w:hAnsi="Arial"/>
+                <w:b/>
+                <w:bCs/>
+                <w:color w:val="1E2422"/>
+                <w:sz w:val="19"/>
+                <w:szCs w:val="19"/>
+              </w:rPr>
+              <w:t xml:space="preserve">Zły kod SMS</w:t>
+            </w:r>
+          </w:p>
+        </w:tc>
+        <w:tc>
+          <w:tcPr>
+            <w:tcW w:type="dxa" w:w="3600"/>
+            <w:tcMar>
+              <w:top w:type="dxa" w:w="70"/>
+              <w:left w:type="dxa" w:w="100"/>
+              <w:bottom w:type="dxa" w:w="70"/>
+              <w:right w:type="dxa" w:w="100"/>
+            </w:tcMar>
+          </w:tcPr>
+          <w:p>
+            <w:pPr>
+              <w:spacing w:after="40" w:line="260"/>
+            </w:pPr>
+            <w:r>
+              <w:rPr>
+                <w:rFonts w:ascii="Arial" w:cs="Arial" w:eastAsia="Arial" w:hAnsi="Arial"/>
+                <w:color w:val="1E2422"/>
+                <w:sz w:val="19"/>
+                <w:szCs w:val="19"/>
+              </w:rPr>
+              <w:t xml:space="preserve">W kroku z kodem wpisz 000000 (albo inny zły kod).</w:t>
+            </w:r>
+          </w:p>
+        </w:tc>
+        <w:tc>
+          <w:tcPr>
+            <w:tcW w:type="dxa" w:w="3518"/>
+            <w:tcMar>
+              <w:top w:type="dxa" w:w="70"/>
+              <w:left w:type="dxa" w:w="100"/>
+              <w:bottom w:type="dxa" w:w="70"/>
+              <w:right w:type="dxa" w:w="100"/>
+            </w:tcMar>
+          </w:tcPr>
+          <w:p>
+            <w:pPr>
+              <w:spacing w:after="40" w:line="260"/>
+            </w:pPr>
+            <w:r>
+              <w:rPr>
+                <w:rFonts w:ascii="Arial" w:cs="Arial" w:eastAsia="Arial" w:hAnsi="Arial"/>
+                <w:color w:val="1E2422"/>
+                <w:sz w:val="19"/>
+                <w:szCs w:val="19"/>
+              </w:rPr>
+              <w:t xml:space="preserve">„Nieprawidłowy kod…”; po 5 złych próbach „Za dużo prób” i powrót do formularza. Zapytanie nie trafia do zakładów.</w:t>
             </w:r>
           </w:p>
         </w:tc>
@@ -6739,6 +7085,238 @@
           </w:p>
         </w:tc>
       </w:tr>
+      <w:tr>
+        <w:trPr>
+          <w:cantSplit/>
+        </w:trPr>
+        <w:tc>
+          <w:tcPr>
+            <w:tcW w:type="dxa" w:w="620"/>
+            <w:tcMar>
+              <w:top w:type="dxa" w:w="70"/>
+              <w:left w:type="dxa" w:w="100"/>
+              <w:bottom w:type="dxa" w:w="70"/>
+              <w:right w:type="dxa" w:w="100"/>
+            </w:tcMar>
+          </w:tcPr>
+          <w:p>
+            <w:pPr>
+              <w:spacing w:after="40" w:line="260"/>
+            </w:pPr>
+            <w:r>
+              <w:rPr>
+                <w:rFonts w:ascii="Arial" w:cs="Arial" w:eastAsia="Arial" w:hAnsi="Arial"/>
+                <w:color w:val="1E2422"/>
+                <w:sz w:val="19"/>
+                <w:szCs w:val="19"/>
+              </w:rPr>
+              <w:t xml:space="preserve">Z14</w:t>
+            </w:r>
+          </w:p>
+        </w:tc>
+        <w:tc>
+          <w:tcPr>
+            <w:tcW w:type="dxa" w:w="1900"/>
+            <w:tcMar>
+              <w:top w:type="dxa" w:w="70"/>
+              <w:left w:type="dxa" w:w="100"/>
+              <w:bottom w:type="dxa" w:w="70"/>
+              <w:right w:type="dxa" w:w="100"/>
+            </w:tcMar>
+          </w:tcPr>
+          <w:p>
+            <w:pPr>
+              <w:spacing w:after="40" w:line="260"/>
+            </w:pPr>
+            <w:r>
+              <w:rPr>
+                <w:rFonts w:ascii="Arial" w:cs="Arial" w:eastAsia="Arial" w:hAnsi="Arial"/>
+                <w:b/>
+                <w:bCs/>
+                <w:color w:val="1E2422"/>
+                <w:sz w:val="19"/>
+                <w:szCs w:val="19"/>
+              </w:rPr>
+              <w:t xml:space="preserve">Zaproszenie pracownika</w:t>
+            </w:r>
+            <w:r>
+              <w:rPr>
+                <w:rFonts w:ascii="Arial" w:cs="Arial" w:eastAsia="Arial" w:hAnsi="Arial"/>
+                <w:color w:val="1E2422"/>
+                <w:sz w:val="19"/>
+                <w:szCs w:val="19"/>
+              </w:rPr>
+              <w:t xml:space="preserve"> (konto: Anna, potem nowa osoba)</w:t>
+            </w:r>
+          </w:p>
+        </w:tc>
+        <w:tc>
+          <w:tcPr>
+            <w:tcW w:type="dxa" w:w="3600"/>
+            <w:tcMar>
+              <w:top w:type="dxa" w:w="70"/>
+              <w:left w:type="dxa" w:w="100"/>
+              <w:bottom w:type="dxa" w:w="70"/>
+              <w:right w:type="dxa" w:w="100"/>
+            </w:tcMar>
+          </w:tcPr>
+          <w:p>
+            <w:pPr>
+              <w:spacing w:after="40" w:line="260"/>
+            </w:pPr>
+            <w:r>
+              <w:rPr>
+                <w:rFonts w:ascii="Arial" w:cs="Arial" w:eastAsia="Arial" w:hAnsi="Arial"/>
+                <w:color w:val="1E2422"/>
+                <w:sz w:val="19"/>
+                <w:szCs w:val="19"/>
+              </w:rPr>
+              <w:t xml:space="preserve">Zespół → wpisz imię, e-mail (np. nowy@cisza.test), rolę Biuro → Utwórz zaproszenie → skopiuj link → otwórz go w oknie prywatnym → Przyjmij zaproszenie.</w:t>
+            </w:r>
+          </w:p>
+        </w:tc>
+        <w:tc>
+          <w:tcPr>
+            <w:tcW w:type="dxa" w:w="3518"/>
+            <w:tcMar>
+              <w:top w:type="dxa" w:w="70"/>
+              <w:left w:type="dxa" w:w="100"/>
+              <w:bottom w:type="dxa" w:w="70"/>
+              <w:right w:type="dxa" w:w="100"/>
+            </w:tcMar>
+          </w:tcPr>
+          <w:p>
+            <w:pPr>
+              <w:spacing w:after="40" w:line="260"/>
+            </w:pPr>
+            <w:r>
+              <w:rPr>
+                <w:rFonts w:ascii="Arial" w:cs="Arial" w:eastAsia="Arial" w:hAnsi="Arial"/>
+                <w:color w:val="1E2422"/>
+                <w:sz w:val="19"/>
+                <w:szCs w:val="19"/>
+              </w:rPr>
+              <w:t xml:space="preserve">Link zaproszenia z przyciskami Kopiuj/SMS/E-mail; po przyjęciu w wersji testowej z Supabase – link logowania na e-mail, bez Supabase – od razu panel. Nowa osoba na liście zespołu.</w:t>
+            </w:r>
+          </w:p>
+        </w:tc>
+      </w:tr>
+      <w:tr>
+        <w:trPr>
+          <w:cantSplit/>
+        </w:trPr>
+        <w:tc>
+          <w:tcPr>
+            <w:tcW w:type="dxa" w:w="620"/>
+            <w:tcMar>
+              <w:top w:type="dxa" w:w="70"/>
+              <w:left w:type="dxa" w:w="100"/>
+              <w:bottom w:type="dxa" w:w="70"/>
+              <w:right w:type="dxa" w:w="100"/>
+            </w:tcMar>
+          </w:tcPr>
+          <w:p>
+            <w:pPr>
+              <w:spacing w:after="40" w:line="260"/>
+            </w:pPr>
+            <w:r>
+              <w:rPr>
+                <w:rFonts w:ascii="Arial" w:cs="Arial" w:eastAsia="Arial" w:hAnsi="Arial"/>
+                <w:color w:val="1E2422"/>
+                <w:sz w:val="19"/>
+                <w:szCs w:val="19"/>
+              </w:rPr>
+              <w:t xml:space="preserve">Z15</w:t>
+            </w:r>
+          </w:p>
+        </w:tc>
+        <w:tc>
+          <w:tcPr>
+            <w:tcW w:type="dxa" w:w="1900"/>
+            <w:tcMar>
+              <w:top w:type="dxa" w:w="70"/>
+              <w:left w:type="dxa" w:w="100"/>
+              <w:bottom w:type="dxa" w:w="70"/>
+              <w:right w:type="dxa" w:w="100"/>
+            </w:tcMar>
+          </w:tcPr>
+          <w:p>
+            <w:pPr>
+              <w:spacing w:after="40" w:line="260"/>
+            </w:pPr>
+            <w:r>
+              <w:rPr>
+                <w:rFonts w:ascii="Arial" w:cs="Arial" w:eastAsia="Arial" w:hAnsi="Arial"/>
+                <w:b/>
+                <w:bCs/>
+                <w:color w:val="1E2422"/>
+                <w:sz w:val="19"/>
+                <w:szCs w:val="19"/>
+              </w:rPr>
+              <w:t xml:space="preserve">Odebranie dostępu</w:t>
+            </w:r>
+            <w:r>
+              <w:rPr>
+                <w:rFonts w:ascii="Arial" w:cs="Arial" w:eastAsia="Arial" w:hAnsi="Arial"/>
+                <w:color w:val="1E2422"/>
+                <w:sz w:val="19"/>
+                <w:szCs w:val="19"/>
+              </w:rPr>
+              <w:t xml:space="preserve"> (konto: Anna Cichońska)</w:t>
+            </w:r>
+          </w:p>
+        </w:tc>
+        <w:tc>
+          <w:tcPr>
+            <w:tcW w:type="dxa" w:w="3600"/>
+            <w:tcMar>
+              <w:top w:type="dxa" w:w="70"/>
+              <w:left w:type="dxa" w:w="100"/>
+              <w:bottom w:type="dxa" w:w="70"/>
+              <w:right w:type="dxa" w:w="100"/>
+            </w:tcMar>
+          </w:tcPr>
+          <w:p>
+            <w:pPr>
+              <w:spacing w:after="40" w:line="260"/>
+            </w:pPr>
+            <w:r>
+              <w:rPr>
+                <w:rFonts w:ascii="Arial" w:cs="Arial" w:eastAsia="Arial" w:hAnsi="Arial"/>
+                <w:color w:val="1E2422"/>
+                <w:sz w:val="19"/>
+                <w:szCs w:val="19"/>
+              </w:rPr>
+              <w:t xml:space="preserve">Zespół → przy nowej osobie Odbierz dostęp → Potwierdzam → Odbierz dostęp.</w:t>
+            </w:r>
+          </w:p>
+        </w:tc>
+        <w:tc>
+          <w:tcPr>
+            <w:tcW w:type="dxa" w:w="3518"/>
+            <w:tcMar>
+              <w:top w:type="dxa" w:w="70"/>
+              <w:left w:type="dxa" w:w="100"/>
+              <w:bottom w:type="dxa" w:w="70"/>
+              <w:right w:type="dxa" w:w="100"/>
+            </w:tcMar>
+          </w:tcPr>
+          <w:p>
+            <w:pPr>
+              <w:spacing w:after="40" w:line="260"/>
+            </w:pPr>
+            <w:r>
+              <w:rPr>
+                <w:rFonts w:ascii="Arial" w:cs="Arial" w:eastAsia="Arial" w:hAnsi="Arial"/>
+                <w:color w:val="1E2422"/>
+                <w:sz w:val="19"/>
+                <w:szCs w:val="19"/>
+              </w:rPr>
+              <w:t xml:space="preserve">„Dostęp odebrany.”; przy następnym kliknięciu ta osoba trafia na stronę logowania.</w:t>
+            </w:r>
+          </w:p>
+        </w:tc>
+      </w:tr>
     </w:tbl>
     <w:p>
       <w:pPr>
@@ -6750,7 +7328,7 @@
         <w:pStyle w:val="Heading2"/>
       </w:pPr>
       <w:r>
-        <w:t xml:space="preserve">5.3. Logowanie</w:t>
+        <w:t xml:space="preserve">5.3. Administracja Ostoi (konto Ola Maj)</w:t>
       </w:r>
     </w:p>
     <w:tbl>
@@ -6914,7 +7492,7 @@
                 <w:sz w:val="19"/>
                 <w:szCs w:val="19"/>
               </w:rPr>
-              <w:t xml:space="preserve">L1</w:t>
+              <w:t xml:space="preserve">A1</w:t>
             </w:r>
           </w:p>
         </w:tc>
@@ -6941,16 +7519,16 @@
                 <w:sz w:val="19"/>
                 <w:szCs w:val="19"/>
               </w:rPr>
-              <w:t xml:space="preserve">Konto testowe</w:t>
-            </w:r>
-            <w:r>
-              <w:rPr>
-                <w:rFonts w:ascii="Arial" w:cs="Arial" w:eastAsia="Arial" w:hAnsi="Arial"/>
-                <w:color w:val="1E2422"/>
-                <w:sz w:val="19"/>
-                <w:szCs w:val="19"/>
-              </w:rPr>
-              <w:t xml:space="preserve"> (konto: dowolne)</w:t>
+              <w:t xml:space="preserve">Dodanie partnera</w:t>
+            </w:r>
+            <w:r>
+              <w:rPr>
+                <w:rFonts w:ascii="Arial" w:cs="Arial" w:eastAsia="Arial" w:hAnsi="Arial"/>
+                <w:color w:val="1E2422"/>
+                <w:sz w:val="19"/>
+                <w:szCs w:val="19"/>
+              </w:rPr>
+              <w:t xml:space="preserve"> (konto: Ola Maj)</w:t>
             </w:r>
           </w:p>
         </w:tc>
@@ -6975,7 +7553,7 @@
                 <w:sz w:val="19"/>
                 <w:szCs w:val="19"/>
               </w:rPr>
-              <w:t xml:space="preserve">/logowanie → kliknij osobę z listy.</w:t>
+              <w:t xml:space="preserve">Zaloguj się → Dodaj partnera → nazwa, NIP (10 cyfr), miasto, adres, telefon, e-mail → Dodaj zakład.</w:t>
             </w:r>
           </w:p>
         </w:tc>
@@ -7000,7 +7578,7 @@
                 <w:sz w:val="19"/>
                 <w:szCs w:val="19"/>
               </w:rPr>
-              <w:t xml:space="preserve">Panel zakładu tej osoby. Lista kont widoczna tylko przy DEMO_MODE=true.</w:t>
+              <w:t xml:space="preserve">Karta zakładu ze statusem „Do weryfikacji”; zakład nie pojawia się rodzinom. Ten sam NIP drugi raz – odmowa.</w:t>
             </w:r>
           </w:p>
         </w:tc>
@@ -7030,7 +7608,7 @@
                 <w:sz w:val="19"/>
                 <w:szCs w:val="19"/>
               </w:rPr>
-              <w:t xml:space="preserve">L2</w:t>
+              <w:t xml:space="preserve">A2</w:t>
             </w:r>
           </w:p>
         </w:tc>
@@ -7057,16 +7635,16 @@
                 <w:sz w:val="19"/>
                 <w:szCs w:val="19"/>
               </w:rPr>
-              <w:t xml:space="preserve">Link z e-maila</w:t>
-            </w:r>
-            <w:r>
-              <w:rPr>
-                <w:rFonts w:ascii="Arial" w:cs="Arial" w:eastAsia="Arial" w:hAnsi="Arial"/>
-                <w:color w:val="1E2422"/>
-                <w:sz w:val="19"/>
-                <w:szCs w:val="19"/>
-              </w:rPr>
-              <w:t xml:space="preserve"> (konto: konto założone w Supabase)</w:t>
+              <w:t xml:space="preserve">Zaproszenie właściciela</w:t>
+            </w:r>
+            <w:r>
+              <w:rPr>
+                <w:rFonts w:ascii="Arial" w:cs="Arial" w:eastAsia="Arial" w:hAnsi="Arial"/>
+                <w:color w:val="1E2422"/>
+                <w:sz w:val="19"/>
+                <w:szCs w:val="19"/>
+              </w:rPr>
+              <w:t xml:space="preserve"> (konto: Ola Maj)</w:t>
             </w:r>
           </w:p>
         </w:tc>
@@ -7091,7 +7669,7 @@
                 <w:sz w:val="19"/>
                 <w:szCs w:val="19"/>
               </w:rPr>
-              <w:t xml:space="preserve">/logowanie → wpisz e-mail → Wyślij link → w mailu Zaloguj się do Ostoi → Zaloguj się.</w:t>
+              <w:t xml:space="preserve">Karta zakładu → Zaproś do panelu (rola Właściciel) → wyślij link → właściciel przyjmuje i loguje się.</w:t>
             </w:r>
           </w:p>
         </w:tc>
@@ -7116,7 +7694,7 @@
                 <w:sz w:val="19"/>
                 <w:szCs w:val="19"/>
               </w:rPr>
-              <w:t xml:space="preserve">Panel zakładu. Ten sam link drugi raz i po godzinie nie działa.</w:t>
+              <w:t xml:space="preserve">Właściciel w „Osoby w panelu”; po zalogowaniu widzi swój zakład, uzupełnia cennik.</w:t>
             </w:r>
           </w:p>
         </w:tc>
@@ -7146,7 +7724,7 @@
                 <w:sz w:val="19"/>
                 <w:szCs w:val="19"/>
               </w:rPr>
-              <w:t xml:space="preserve">L3</w:t>
+              <w:t xml:space="preserve">A3</w:t>
             </w:r>
           </w:p>
         </w:tc>
@@ -7173,16 +7751,16 @@
                 <w:sz w:val="19"/>
                 <w:szCs w:val="19"/>
               </w:rPr>
-              <w:t xml:space="preserve">Panel bez logowania</w:t>
-            </w:r>
-            <w:r>
-              <w:rPr>
-                <w:rFonts w:ascii="Arial" w:cs="Arial" w:eastAsia="Arial" w:hAnsi="Arial"/>
-                <w:color w:val="1E2422"/>
-                <w:sz w:val="19"/>
-                <w:szCs w:val="19"/>
-              </w:rPr>
-              <w:t xml:space="preserve"> (konto: brak)</w:t>
+              <w:t xml:space="preserve">Weryfikacja i wstrzymanie</w:t>
+            </w:r>
+            <w:r>
+              <w:rPr>
+                <w:rFonts w:ascii="Arial" w:cs="Arial" w:eastAsia="Arial" w:hAnsi="Arial"/>
+                <w:color w:val="1E2422"/>
+                <w:sz w:val="19"/>
+                <w:szCs w:val="19"/>
+              </w:rPr>
+              <w:t xml:space="preserve"> (konto: Ola Maj)</w:t>
             </w:r>
           </w:p>
         </w:tc>
@@ -7207,7 +7785,7 @@
                 <w:sz w:val="19"/>
                 <w:szCs w:val="19"/>
               </w:rPr>
-              <w:t xml:space="preserve">W oknie prywatnym otwórz /panel/zlecenia.</w:t>
+              <w:t xml:space="preserve">Karta zakładu → zaznacz „Sprawdziłem dokumenty” → Zweryfikuj zakład; potem Wstrzymaj zakład.</w:t>
             </w:r>
           </w:p>
         </w:tc>
@@ -7232,7 +7810,239 @@
                 <w:sz w:val="19"/>
                 <w:szCs w:val="19"/>
               </w:rPr>
-              <w:t xml:space="preserve">Przekierowanie na /logowanie.</w:t>
+              <w:t xml:space="preserve">Po weryfikacji (i z pełnym cennikiem) zakład jest na liście ofert; po wstrzymaniu znika i nie dostaje zapytań.</w:t>
+            </w:r>
+          </w:p>
+        </w:tc>
+      </w:tr>
+      <w:tr>
+        <w:trPr>
+          <w:cantSplit/>
+        </w:trPr>
+        <w:tc>
+          <w:tcPr>
+            <w:tcW w:type="dxa" w:w="620"/>
+            <w:tcMar>
+              <w:top w:type="dxa" w:w="70"/>
+              <w:left w:type="dxa" w:w="100"/>
+              <w:bottom w:type="dxa" w:w="70"/>
+              <w:right w:type="dxa" w:w="100"/>
+            </w:tcMar>
+          </w:tcPr>
+          <w:p>
+            <w:pPr>
+              <w:spacing w:after="40" w:line="260"/>
+            </w:pPr>
+            <w:r>
+              <w:rPr>
+                <w:rFonts w:ascii="Arial" w:cs="Arial" w:eastAsia="Arial" w:hAnsi="Arial"/>
+                <w:color w:val="1E2422"/>
+                <w:sz w:val="19"/>
+                <w:szCs w:val="19"/>
+              </w:rPr>
+              <w:t xml:space="preserve">A4</w:t>
+            </w:r>
+          </w:p>
+        </w:tc>
+        <w:tc>
+          <w:tcPr>
+            <w:tcW w:type="dxa" w:w="1900"/>
+            <w:tcMar>
+              <w:top w:type="dxa" w:w="70"/>
+              <w:left w:type="dxa" w:w="100"/>
+              <w:bottom w:type="dxa" w:w="70"/>
+              <w:right w:type="dxa" w:w="100"/>
+            </w:tcMar>
+          </w:tcPr>
+          <w:p>
+            <w:pPr>
+              <w:spacing w:after="40" w:line="260"/>
+            </w:pPr>
+            <w:r>
+              <w:rPr>
+                <w:rFonts w:ascii="Arial" w:cs="Arial" w:eastAsia="Arial" w:hAnsi="Arial"/>
+                <w:b/>
+                <w:bCs/>
+                <w:color w:val="1E2422"/>
+                <w:sz w:val="19"/>
+                <w:szCs w:val="19"/>
+              </w:rPr>
+              <w:t xml:space="preserve">Zapytania do opiekuna</w:t>
+            </w:r>
+            <w:r>
+              <w:rPr>
+                <w:rFonts w:ascii="Arial" w:cs="Arial" w:eastAsia="Arial" w:hAnsi="Arial"/>
+                <w:color w:val="1E2422"/>
+                <w:sz w:val="19"/>
+                <w:szCs w:val="19"/>
+              </w:rPr>
+              <w:t xml:space="preserve"> (konto: Ola Maj)</w:t>
+            </w:r>
+          </w:p>
+        </w:tc>
+        <w:tc>
+          <w:tcPr>
+            <w:tcW w:type="dxa" w:w="3600"/>
+            <w:tcMar>
+              <w:top w:type="dxa" w:w="70"/>
+              <w:left w:type="dxa" w:w="100"/>
+              <w:bottom w:type="dxa" w:w="70"/>
+              <w:right w:type="dxa" w:w="100"/>
+            </w:tcMar>
+          </w:tcPr>
+          <w:p>
+            <w:pPr>
+              <w:spacing w:after="40" w:line="260"/>
+            </w:pPr>
+            <w:r>
+              <w:rPr>
+                <w:rFonts w:ascii="Arial" w:cs="Arial" w:eastAsia="Arial" w:hAnsi="Arial"/>
+                <w:color w:val="1E2422"/>
+                <w:sz w:val="19"/>
+                <w:szCs w:val="19"/>
+              </w:rPr>
+              <w:t xml:space="preserve">Do opiekuna → zadzwoń (fikcyjny numer) → notatka → Oznacz jako obsłużone.</w:t>
+            </w:r>
+          </w:p>
+        </w:tc>
+        <w:tc>
+          <w:tcPr>
+            <w:tcW w:type="dxa" w:w="3518"/>
+            <w:tcMar>
+              <w:top w:type="dxa" w:w="70"/>
+              <w:left w:type="dxa" w:w="100"/>
+              <w:bottom w:type="dxa" w:w="70"/>
+              <w:right w:type="dxa" w:w="100"/>
+            </w:tcMar>
+          </w:tcPr>
+          <w:p>
+            <w:pPr>
+              <w:spacing w:after="40" w:line="260"/>
+            </w:pPr>
+            <w:r>
+              <w:rPr>
+                <w:rFonts w:ascii="Arial" w:cs="Arial" w:eastAsia="Arial" w:hAnsi="Arial"/>
+                <w:color w:val="1E2422"/>
+                <w:sz w:val="19"/>
+                <w:szCs w:val="19"/>
+              </w:rPr>
+              <w:t xml:space="preserve">Zapytanie Renaty Testowej z telefonem; po oznaczeniu przechodzi do „Obsłużone w ostatnim tygodniu”.</w:t>
+            </w:r>
+          </w:p>
+        </w:tc>
+      </w:tr>
+      <w:tr>
+        <w:trPr>
+          <w:cantSplit/>
+        </w:trPr>
+        <w:tc>
+          <w:tcPr>
+            <w:tcW w:type="dxa" w:w="620"/>
+            <w:tcMar>
+              <w:top w:type="dxa" w:w="70"/>
+              <w:left w:type="dxa" w:w="100"/>
+              <w:bottom w:type="dxa" w:w="70"/>
+              <w:right w:type="dxa" w:w="100"/>
+            </w:tcMar>
+          </w:tcPr>
+          <w:p>
+            <w:pPr>
+              <w:spacing w:after="40" w:line="260"/>
+            </w:pPr>
+            <w:r>
+              <w:rPr>
+                <w:rFonts w:ascii="Arial" w:cs="Arial" w:eastAsia="Arial" w:hAnsi="Arial"/>
+                <w:color w:val="1E2422"/>
+                <w:sz w:val="19"/>
+                <w:szCs w:val="19"/>
+              </w:rPr>
+              <w:t xml:space="preserve">A5</w:t>
+            </w:r>
+          </w:p>
+        </w:tc>
+        <w:tc>
+          <w:tcPr>
+            <w:tcW w:type="dxa" w:w="1900"/>
+            <w:tcMar>
+              <w:top w:type="dxa" w:w="70"/>
+              <w:left w:type="dxa" w:w="100"/>
+              <w:bottom w:type="dxa" w:w="70"/>
+              <w:right w:type="dxa" w:w="100"/>
+            </w:tcMar>
+          </w:tcPr>
+          <w:p>
+            <w:pPr>
+              <w:spacing w:after="40" w:line="260"/>
+            </w:pPr>
+            <w:r>
+              <w:rPr>
+                <w:rFonts w:ascii="Arial" w:cs="Arial" w:eastAsia="Arial" w:hAnsi="Arial"/>
+                <w:b/>
+                <w:bCs/>
+                <w:color w:val="1E2422"/>
+                <w:sz w:val="19"/>
+                <w:szCs w:val="19"/>
+              </w:rPr>
+              <w:t xml:space="preserve">Rozliczenia i dostęp</w:t>
+            </w:r>
+            <w:r>
+              <w:rPr>
+                <w:rFonts w:ascii="Arial" w:cs="Arial" w:eastAsia="Arial" w:hAnsi="Arial"/>
+                <w:color w:val="1E2422"/>
+                <w:sz w:val="19"/>
+                <w:szCs w:val="19"/>
+              </w:rPr>
+              <w:t xml:space="preserve"> (konto: Ola Maj, potem Anna)</w:t>
+            </w:r>
+          </w:p>
+        </w:tc>
+        <w:tc>
+          <w:tcPr>
+            <w:tcW w:type="dxa" w:w="3600"/>
+            <w:tcMar>
+              <w:top w:type="dxa" w:w="70"/>
+              <w:left w:type="dxa" w:w="100"/>
+              <w:bottom w:type="dxa" w:w="70"/>
+              <w:right w:type="dxa" w:w="100"/>
+            </w:tcMar>
+          </w:tcPr>
+          <w:p>
+            <w:pPr>
+              <w:spacing w:after="40" w:line="260"/>
+            </w:pPr>
+            <w:r>
+              <w:rPr>
+                <w:rFonts w:ascii="Arial" w:cs="Arial" w:eastAsia="Arial" w:hAnsi="Arial"/>
+                <w:color w:val="1E2422"/>
+                <w:sz w:val="19"/>
+                <w:szCs w:val="19"/>
+              </w:rPr>
+              <w:t xml:space="preserve">Rozliczenia (bieżący miesiąc) → potem zaloguj się jako Anna i otwórz /admin.</w:t>
+            </w:r>
+          </w:p>
+        </w:tc>
+        <w:tc>
+          <w:tcPr>
+            <w:tcW w:type="dxa" w:w="3518"/>
+            <w:tcMar>
+              <w:top w:type="dxa" w:w="70"/>
+              <w:left w:type="dxa" w:w="100"/>
+              <w:bottom w:type="dxa" w:w="70"/>
+              <w:right w:type="dxa" w:w="100"/>
+            </w:tcMar>
+          </w:tcPr>
+          <w:p>
+            <w:pPr>
+              <w:spacing w:after="40" w:line="260"/>
+            </w:pPr>
+            <w:r>
+              <w:rPr>
+                <w:rFonts w:ascii="Arial" w:cs="Arial" w:eastAsia="Arial" w:hAnsi="Arial"/>
+                <w:color w:val="1E2422"/>
+                <w:sz w:val="19"/>
+                <w:szCs w:val="19"/>
+              </w:rPr>
+              <w:t xml:space="preserve">Lista zakładów z liczbą zleceń i kwotą do faktury; Anna nie wchodzi do administracji.</w:t>
             </w:r>
           </w:p>
         </w:tc>
@@ -7248,7 +8058,7 @@
         <w:pStyle w:val="Heading2"/>
       </w:pPr>
       <w:r>
-        <w:t xml:space="preserve">5.4. Powiadomienia</w:t>
+        <w:t xml:space="preserve">5.4. Logowanie</w:t>
       </w:r>
     </w:p>
     <w:tbl>
@@ -7412,7 +8222,7 @@
                 <w:sz w:val="19"/>
                 <w:szCs w:val="19"/>
               </w:rPr>
-              <w:t xml:space="preserve">P1</w:t>
+              <w:t xml:space="preserve">L1</w:t>
             </w:r>
           </w:p>
         </w:tc>
@@ -7439,16 +8249,16 @@
                 <w:sz w:val="19"/>
                 <w:szCs w:val="19"/>
               </w:rPr>
-              <w:t xml:space="preserve">Push o nowym zapytaniu</w:t>
-            </w:r>
-            <w:r>
-              <w:rPr>
-                <w:rFonts w:ascii="Arial" w:cs="Arial" w:eastAsia="Arial" w:hAnsi="Arial"/>
-                <w:color w:val="1E2422"/>
-                <w:sz w:val="19"/>
-                <w:szCs w:val="19"/>
-              </w:rPr>
-              <w:t xml:space="preserve"> (konto: Anna Cichońska)</w:t>
+              <w:t xml:space="preserve">Konto testowe</w:t>
+            </w:r>
+            <w:r>
+              <w:rPr>
+                <w:rFonts w:ascii="Arial" w:cs="Arial" w:eastAsia="Arial" w:hAnsi="Arial"/>
+                <w:color w:val="1E2422"/>
+                <w:sz w:val="19"/>
+                <w:szCs w:val="19"/>
+              </w:rPr>
+              <w:t xml:space="preserve"> (konto: dowolne)</w:t>
             </w:r>
           </w:p>
         </w:tc>
@@ -7473,7 +8283,7 @@
                 <w:sz w:val="19"/>
                 <w:szCs w:val="19"/>
               </w:rPr>
-              <w:t xml:space="preserve">Na telefonie: Zapytania → Włącz powiadomienia → zezwól → zablokuj telefon. Na komputerze wyślij zapytanie do Ciszy (R4).</w:t>
+              <w:t xml:space="preserve">/logowanie → kliknij osobę z listy.</w:t>
             </w:r>
           </w:p>
         </w:tc>
@@ -7498,7 +8308,7 @@
                 <w:sz w:val="19"/>
                 <w:szCs w:val="19"/>
               </w:rPr>
-              <w:t xml:space="preserve">W ciągu minuty na ekranie blokady „Nowe zapytanie – odpowiedz w 15 minut” z rodzajem pogrzebu i miastem, bez danych rodziny. Kliknięcie otwiera skrzynkę.</w:t>
+              <w:t xml:space="preserve">Panel zakładu tej osoby. Lista kont widoczna tylko przy DEMO_MODE=true.</w:t>
             </w:r>
           </w:p>
         </w:tc>
@@ -7528,7 +8338,7 @@
                 <w:sz w:val="19"/>
                 <w:szCs w:val="19"/>
               </w:rPr>
-              <w:t xml:space="preserve">P2</w:t>
+              <w:t xml:space="preserve">L2</w:t>
             </w:r>
           </w:p>
         </w:tc>
@@ -7555,16 +8365,16 @@
                 <w:sz w:val="19"/>
                 <w:szCs w:val="19"/>
               </w:rPr>
-              <w:t xml:space="preserve">Push na iPhonie</w:t>
-            </w:r>
-            <w:r>
-              <w:rPr>
-                <w:rFonts w:ascii="Arial" w:cs="Arial" w:eastAsia="Arial" w:hAnsi="Arial"/>
-                <w:color w:val="1E2422"/>
-                <w:sz w:val="19"/>
-                <w:szCs w:val="19"/>
-              </w:rPr>
-              <w:t xml:space="preserve"> (konto: Anna Cichońska)</w:t>
+              <w:t xml:space="preserve">Link z e-maila</w:t>
+            </w:r>
+            <w:r>
+              <w:rPr>
+                <w:rFonts w:ascii="Arial" w:cs="Arial" w:eastAsia="Arial" w:hAnsi="Arial"/>
+                <w:color w:val="1E2422"/>
+                <w:sz w:val="19"/>
+                <w:szCs w:val="19"/>
+              </w:rPr>
+              <w:t xml:space="preserve"> (konto: konto założone w Supabase)</w:t>
             </w:r>
           </w:p>
         </w:tc>
@@ -7589,7 +8399,7 @@
                 <w:sz w:val="19"/>
                 <w:szCs w:val="19"/>
               </w:rPr>
-              <w:t xml:space="preserve">Safari → Udostępnij → Do ekranu początkowego → otwórz panel z ikony → powtórz P1.</w:t>
+              <w:t xml:space="preserve">/logowanie → wpisz e-mail → Wyślij link → w mailu Zaloguj się do Ostoi → Zaloguj się.</w:t>
             </w:r>
           </w:p>
         </w:tc>
@@ -7614,7 +8424,7 @@
                 <w:sz w:val="19"/>
                 <w:szCs w:val="19"/>
               </w:rPr>
-              <w:t xml:space="preserve">Jak P1 (wymaga iOS 16.4 lub nowszego).</w:t>
+              <w:t xml:space="preserve">Panel zakładu. Ten sam link drugi raz i po godzinie nie działa.</w:t>
             </w:r>
           </w:p>
         </w:tc>
@@ -7644,7 +8454,7 @@
                 <w:sz w:val="19"/>
                 <w:szCs w:val="19"/>
               </w:rPr>
-              <w:t xml:space="preserve">P3</w:t>
+              <w:t xml:space="preserve">L3</w:t>
             </w:r>
           </w:p>
         </w:tc>
@@ -7671,16 +8481,16 @@
                 <w:sz w:val="19"/>
                 <w:szCs w:val="19"/>
               </w:rPr>
-              <w:t xml:space="preserve">Prawdziwy SMS (opcjonalnie)</w:t>
-            </w:r>
-            <w:r>
-              <w:rPr>
-                <w:rFonts w:ascii="Arial" w:cs="Arial" w:eastAsia="Arial" w:hAnsi="Arial"/>
-                <w:color w:val="1E2422"/>
-                <w:sz w:val="19"/>
-                <w:szCs w:val="19"/>
-              </w:rPr>
-              <w:t xml:space="preserve"> (konto: Anna Cichońska)</w:t>
+              <w:t xml:space="preserve">Panel bez logowania</w:t>
+            </w:r>
+            <w:r>
+              <w:rPr>
+                <w:rFonts w:ascii="Arial" w:cs="Arial" w:eastAsia="Arial" w:hAnsi="Arial"/>
+                <w:color w:val="1E2422"/>
+                <w:sz w:val="19"/>
+                <w:szCs w:val="19"/>
+              </w:rPr>
+              <w:t xml:space="preserve"> (konto: brak)</w:t>
             </w:r>
           </w:p>
         </w:tc>
@@ -7705,7 +8515,7 @@
                 <w:sz w:val="19"/>
                 <w:szCs w:val="19"/>
               </w:rPr>
-              <w:t xml:space="preserve">Ustaw SMSAPI_TOKEN i SMSAPI_TEST=false → w zleceniu testowym wpisz własny numer → Wyślij SMS z linkiem.</w:t>
+              <w:t xml:space="preserve">W oknie prywatnym otwórz /panel/zlecenia.</w:t>
             </w:r>
           </w:p>
         </w:tc>
@@ -7730,7 +8540,7 @@
                 <w:sz w:val="19"/>
                 <w:szCs w:val="19"/>
               </w:rPr>
-              <w:t xml:space="preserve">SMS z linkiem dla rodziny na Twój telefon; status „wysłano”.</w:t>
+              <w:t xml:space="preserve">Przekierowanie na /logowanie.</w:t>
             </w:r>
           </w:p>
         </w:tc>
@@ -7746,7 +8556,7 @@
         <w:pStyle w:val="Heading2"/>
       </w:pPr>
       <w:r>
-        <w:t xml:space="preserve">5.5. Prywatność</w:t>
+        <w:t xml:space="preserve">5.5. Powiadomienia</w:t>
       </w:r>
     </w:p>
     <w:tbl>
@@ -7910,6 +8720,504 @@
                 <w:sz w:val="19"/>
                 <w:szCs w:val="19"/>
               </w:rPr>
+              <w:t xml:space="preserve">P1</w:t>
+            </w:r>
+          </w:p>
+        </w:tc>
+        <w:tc>
+          <w:tcPr>
+            <w:tcW w:type="dxa" w:w="1900"/>
+            <w:tcMar>
+              <w:top w:type="dxa" w:w="70"/>
+              <w:left w:type="dxa" w:w="100"/>
+              <w:bottom w:type="dxa" w:w="70"/>
+              <w:right w:type="dxa" w:w="100"/>
+            </w:tcMar>
+          </w:tcPr>
+          <w:p>
+            <w:pPr>
+              <w:spacing w:after="40" w:line="260"/>
+            </w:pPr>
+            <w:r>
+              <w:rPr>
+                <w:rFonts w:ascii="Arial" w:cs="Arial" w:eastAsia="Arial" w:hAnsi="Arial"/>
+                <w:b/>
+                <w:bCs/>
+                <w:color w:val="1E2422"/>
+                <w:sz w:val="19"/>
+                <w:szCs w:val="19"/>
+              </w:rPr>
+              <w:t xml:space="preserve">Push o nowym zapytaniu</w:t>
+            </w:r>
+            <w:r>
+              <w:rPr>
+                <w:rFonts w:ascii="Arial" w:cs="Arial" w:eastAsia="Arial" w:hAnsi="Arial"/>
+                <w:color w:val="1E2422"/>
+                <w:sz w:val="19"/>
+                <w:szCs w:val="19"/>
+              </w:rPr>
+              <w:t xml:space="preserve"> (konto: Anna Cichońska)</w:t>
+            </w:r>
+          </w:p>
+        </w:tc>
+        <w:tc>
+          <w:tcPr>
+            <w:tcW w:type="dxa" w:w="3600"/>
+            <w:tcMar>
+              <w:top w:type="dxa" w:w="70"/>
+              <w:left w:type="dxa" w:w="100"/>
+              <w:bottom w:type="dxa" w:w="70"/>
+              <w:right w:type="dxa" w:w="100"/>
+            </w:tcMar>
+          </w:tcPr>
+          <w:p>
+            <w:pPr>
+              <w:spacing w:after="40" w:line="260"/>
+            </w:pPr>
+            <w:r>
+              <w:rPr>
+                <w:rFonts w:ascii="Arial" w:cs="Arial" w:eastAsia="Arial" w:hAnsi="Arial"/>
+                <w:color w:val="1E2422"/>
+                <w:sz w:val="19"/>
+                <w:szCs w:val="19"/>
+              </w:rPr>
+              <w:t xml:space="preserve">Na telefonie: Zapytania → Włącz powiadomienia → zezwól → zablokuj telefon. Na komputerze wyślij zapytanie do Ciszy (R4).</w:t>
+            </w:r>
+          </w:p>
+        </w:tc>
+        <w:tc>
+          <w:tcPr>
+            <w:tcW w:type="dxa" w:w="3518"/>
+            <w:tcMar>
+              <w:top w:type="dxa" w:w="70"/>
+              <w:left w:type="dxa" w:w="100"/>
+              <w:bottom w:type="dxa" w:w="70"/>
+              <w:right w:type="dxa" w:w="100"/>
+            </w:tcMar>
+          </w:tcPr>
+          <w:p>
+            <w:pPr>
+              <w:spacing w:after="40" w:line="260"/>
+            </w:pPr>
+            <w:r>
+              <w:rPr>
+                <w:rFonts w:ascii="Arial" w:cs="Arial" w:eastAsia="Arial" w:hAnsi="Arial"/>
+                <w:color w:val="1E2422"/>
+                <w:sz w:val="19"/>
+                <w:szCs w:val="19"/>
+              </w:rPr>
+              <w:t xml:space="preserve">W ciągu minuty na ekranie blokady „Nowe zapytanie – odpowiedz w 15 minut” z rodzajem pogrzebu i miastem, bez danych rodziny. Kliknięcie otwiera skrzynkę.</w:t>
+            </w:r>
+          </w:p>
+        </w:tc>
+      </w:tr>
+      <w:tr>
+        <w:trPr>
+          <w:cantSplit/>
+        </w:trPr>
+        <w:tc>
+          <w:tcPr>
+            <w:tcW w:type="dxa" w:w="620"/>
+            <w:tcMar>
+              <w:top w:type="dxa" w:w="70"/>
+              <w:left w:type="dxa" w:w="100"/>
+              <w:bottom w:type="dxa" w:w="70"/>
+              <w:right w:type="dxa" w:w="100"/>
+            </w:tcMar>
+          </w:tcPr>
+          <w:p>
+            <w:pPr>
+              <w:spacing w:after="40" w:line="260"/>
+            </w:pPr>
+            <w:r>
+              <w:rPr>
+                <w:rFonts w:ascii="Arial" w:cs="Arial" w:eastAsia="Arial" w:hAnsi="Arial"/>
+                <w:color w:val="1E2422"/>
+                <w:sz w:val="19"/>
+                <w:szCs w:val="19"/>
+              </w:rPr>
+              <w:t xml:space="preserve">P2</w:t>
+            </w:r>
+          </w:p>
+        </w:tc>
+        <w:tc>
+          <w:tcPr>
+            <w:tcW w:type="dxa" w:w="1900"/>
+            <w:tcMar>
+              <w:top w:type="dxa" w:w="70"/>
+              <w:left w:type="dxa" w:w="100"/>
+              <w:bottom w:type="dxa" w:w="70"/>
+              <w:right w:type="dxa" w:w="100"/>
+            </w:tcMar>
+          </w:tcPr>
+          <w:p>
+            <w:pPr>
+              <w:spacing w:after="40" w:line="260"/>
+            </w:pPr>
+            <w:r>
+              <w:rPr>
+                <w:rFonts w:ascii="Arial" w:cs="Arial" w:eastAsia="Arial" w:hAnsi="Arial"/>
+                <w:b/>
+                <w:bCs/>
+                <w:color w:val="1E2422"/>
+                <w:sz w:val="19"/>
+                <w:szCs w:val="19"/>
+              </w:rPr>
+              <w:t xml:space="preserve">Push na iPhonie</w:t>
+            </w:r>
+            <w:r>
+              <w:rPr>
+                <w:rFonts w:ascii="Arial" w:cs="Arial" w:eastAsia="Arial" w:hAnsi="Arial"/>
+                <w:color w:val="1E2422"/>
+                <w:sz w:val="19"/>
+                <w:szCs w:val="19"/>
+              </w:rPr>
+              <w:t xml:space="preserve"> (konto: Anna Cichońska)</w:t>
+            </w:r>
+          </w:p>
+        </w:tc>
+        <w:tc>
+          <w:tcPr>
+            <w:tcW w:type="dxa" w:w="3600"/>
+            <w:tcMar>
+              <w:top w:type="dxa" w:w="70"/>
+              <w:left w:type="dxa" w:w="100"/>
+              <w:bottom w:type="dxa" w:w="70"/>
+              <w:right w:type="dxa" w:w="100"/>
+            </w:tcMar>
+          </w:tcPr>
+          <w:p>
+            <w:pPr>
+              <w:spacing w:after="40" w:line="260"/>
+            </w:pPr>
+            <w:r>
+              <w:rPr>
+                <w:rFonts w:ascii="Arial" w:cs="Arial" w:eastAsia="Arial" w:hAnsi="Arial"/>
+                <w:color w:val="1E2422"/>
+                <w:sz w:val="19"/>
+                <w:szCs w:val="19"/>
+              </w:rPr>
+              <w:t xml:space="preserve">Safari → Udostępnij → Do ekranu początkowego → otwórz panel z ikony → powtórz P1.</w:t>
+            </w:r>
+          </w:p>
+        </w:tc>
+        <w:tc>
+          <w:tcPr>
+            <w:tcW w:type="dxa" w:w="3518"/>
+            <w:tcMar>
+              <w:top w:type="dxa" w:w="70"/>
+              <w:left w:type="dxa" w:w="100"/>
+              <w:bottom w:type="dxa" w:w="70"/>
+              <w:right w:type="dxa" w:w="100"/>
+            </w:tcMar>
+          </w:tcPr>
+          <w:p>
+            <w:pPr>
+              <w:spacing w:after="40" w:line="260"/>
+            </w:pPr>
+            <w:r>
+              <w:rPr>
+                <w:rFonts w:ascii="Arial" w:cs="Arial" w:eastAsia="Arial" w:hAnsi="Arial"/>
+                <w:color w:val="1E2422"/>
+                <w:sz w:val="19"/>
+                <w:szCs w:val="19"/>
+              </w:rPr>
+              <w:t xml:space="preserve">Jak P1 (wymaga iOS 16.4 lub nowszego).</w:t>
+            </w:r>
+          </w:p>
+        </w:tc>
+      </w:tr>
+      <w:tr>
+        <w:trPr>
+          <w:cantSplit/>
+        </w:trPr>
+        <w:tc>
+          <w:tcPr>
+            <w:tcW w:type="dxa" w:w="620"/>
+            <w:tcMar>
+              <w:top w:type="dxa" w:w="70"/>
+              <w:left w:type="dxa" w:w="100"/>
+              <w:bottom w:type="dxa" w:w="70"/>
+              <w:right w:type="dxa" w:w="100"/>
+            </w:tcMar>
+          </w:tcPr>
+          <w:p>
+            <w:pPr>
+              <w:spacing w:after="40" w:line="260"/>
+            </w:pPr>
+            <w:r>
+              <w:rPr>
+                <w:rFonts w:ascii="Arial" w:cs="Arial" w:eastAsia="Arial" w:hAnsi="Arial"/>
+                <w:color w:val="1E2422"/>
+                <w:sz w:val="19"/>
+                <w:szCs w:val="19"/>
+              </w:rPr>
+              <w:t xml:space="preserve">P3</w:t>
+            </w:r>
+          </w:p>
+        </w:tc>
+        <w:tc>
+          <w:tcPr>
+            <w:tcW w:type="dxa" w:w="1900"/>
+            <w:tcMar>
+              <w:top w:type="dxa" w:w="70"/>
+              <w:left w:type="dxa" w:w="100"/>
+              <w:bottom w:type="dxa" w:w="70"/>
+              <w:right w:type="dxa" w:w="100"/>
+            </w:tcMar>
+          </w:tcPr>
+          <w:p>
+            <w:pPr>
+              <w:spacing w:after="40" w:line="260"/>
+            </w:pPr>
+            <w:r>
+              <w:rPr>
+                <w:rFonts w:ascii="Arial" w:cs="Arial" w:eastAsia="Arial" w:hAnsi="Arial"/>
+                <w:b/>
+                <w:bCs/>
+                <w:color w:val="1E2422"/>
+                <w:sz w:val="19"/>
+                <w:szCs w:val="19"/>
+              </w:rPr>
+              <w:t xml:space="preserve">Prawdziwy SMS (opcjonalnie)</w:t>
+            </w:r>
+            <w:r>
+              <w:rPr>
+                <w:rFonts w:ascii="Arial" w:cs="Arial" w:eastAsia="Arial" w:hAnsi="Arial"/>
+                <w:color w:val="1E2422"/>
+                <w:sz w:val="19"/>
+                <w:szCs w:val="19"/>
+              </w:rPr>
+              <w:t xml:space="preserve"> (konto: Anna Cichońska)</w:t>
+            </w:r>
+          </w:p>
+        </w:tc>
+        <w:tc>
+          <w:tcPr>
+            <w:tcW w:type="dxa" w:w="3600"/>
+            <w:tcMar>
+              <w:top w:type="dxa" w:w="70"/>
+              <w:left w:type="dxa" w:w="100"/>
+              <w:bottom w:type="dxa" w:w="70"/>
+              <w:right w:type="dxa" w:w="100"/>
+            </w:tcMar>
+          </w:tcPr>
+          <w:p>
+            <w:pPr>
+              <w:spacing w:after="40" w:line="260"/>
+            </w:pPr>
+            <w:r>
+              <w:rPr>
+                <w:rFonts w:ascii="Arial" w:cs="Arial" w:eastAsia="Arial" w:hAnsi="Arial"/>
+                <w:color w:val="1E2422"/>
+                <w:sz w:val="19"/>
+                <w:szCs w:val="19"/>
+              </w:rPr>
+              <w:t xml:space="preserve">Ustaw SMSAPI_TOKEN i SMSAPI_TEST=false → w zleceniu testowym wpisz własny numer → Wyślij SMS z linkiem.</w:t>
+            </w:r>
+          </w:p>
+        </w:tc>
+        <w:tc>
+          <w:tcPr>
+            <w:tcW w:type="dxa" w:w="3518"/>
+            <w:tcMar>
+              <w:top w:type="dxa" w:w="70"/>
+              <w:left w:type="dxa" w:w="100"/>
+              <w:bottom w:type="dxa" w:w="70"/>
+              <w:right w:type="dxa" w:w="100"/>
+            </w:tcMar>
+          </w:tcPr>
+          <w:p>
+            <w:pPr>
+              <w:spacing w:after="40" w:line="260"/>
+            </w:pPr>
+            <w:r>
+              <w:rPr>
+                <w:rFonts w:ascii="Arial" w:cs="Arial" w:eastAsia="Arial" w:hAnsi="Arial"/>
+                <w:color w:val="1E2422"/>
+                <w:sz w:val="19"/>
+                <w:szCs w:val="19"/>
+              </w:rPr>
+              <w:t xml:space="preserve">SMS z linkiem dla rodziny na Twój telefon; status „wysłano”.</w:t>
+            </w:r>
+          </w:p>
+        </w:tc>
+      </w:tr>
+    </w:tbl>
+    <w:p>
+      <w:pPr>
+        <w:spacing w:after="160"/>
+      </w:pPr>
+    </w:p>
+    <w:p>
+      <w:pPr>
+        <w:pStyle w:val="Heading2"/>
+      </w:pPr>
+      <w:r>
+        <w:t xml:space="preserve">5.6. Prywatność</w:t>
+      </w:r>
+    </w:p>
+    <w:tbl>
+      <w:tblPr>
+        <w:tblW w:type="dxa" w:w="9638"/>
+        <w:tblBorders>
+          <w:top w:val="single" w:color="D8DAD7" w:sz="4"/>
+          <w:left w:val="single" w:color="D8DAD7" w:sz="4"/>
+          <w:bottom w:val="single" w:color="D8DAD7" w:sz="4"/>
+          <w:right w:val="single" w:color="D8DAD7" w:sz="4"/>
+          <w:insideH w:val="single" w:color="D8DAD7" w:sz="4"/>
+          <w:insideV w:val="single" w:color="D8DAD7" w:sz="4"/>
+        </w:tblBorders>
+        <w:tblLayout w:type="fixed"/>
+      </w:tblPr>
+      <w:tblGrid>
+        <w:gridCol w:w="620"/>
+        <w:gridCol w:w="1900"/>
+        <w:gridCol w:w="3600"/>
+        <w:gridCol w:w="3518"/>
+      </w:tblGrid>
+      <w:tr>
+        <w:trPr>
+          <w:tblHeader/>
+        </w:trPr>
+        <w:tc>
+          <w:tcPr>
+            <w:tcW w:type="dxa" w:w="620"/>
+            <w:shd w:fill="E6EAE8" w:color="auto" w:val="clear"/>
+            <w:tcMar>
+              <w:top w:type="dxa" w:w="70"/>
+              <w:left w:type="dxa" w:w="100"/>
+              <w:bottom w:type="dxa" w:w="70"/>
+              <w:right w:type="dxa" w:w="100"/>
+            </w:tcMar>
+          </w:tcPr>
+          <w:p>
+            <w:pPr>
+              <w:spacing w:after="40" w:line="260"/>
+            </w:pPr>
+            <w:r>
+              <w:rPr>
+                <w:rFonts w:ascii="Arial" w:cs="Arial" w:eastAsia="Arial" w:hAnsi="Arial"/>
+                <w:b/>
+                <w:bCs/>
+                <w:color w:val="3F5650"/>
+                <w:sz w:val="19"/>
+                <w:szCs w:val="19"/>
+              </w:rPr>
+              <w:t xml:space="preserve">Nr</w:t>
+            </w:r>
+          </w:p>
+        </w:tc>
+        <w:tc>
+          <w:tcPr>
+            <w:tcW w:type="dxa" w:w="1900"/>
+            <w:shd w:fill="E6EAE8" w:color="auto" w:val="clear"/>
+            <w:tcMar>
+              <w:top w:type="dxa" w:w="70"/>
+              <w:left w:type="dxa" w:w="100"/>
+              <w:bottom w:type="dxa" w:w="70"/>
+              <w:right w:type="dxa" w:w="100"/>
+            </w:tcMar>
+          </w:tcPr>
+          <w:p>
+            <w:pPr>
+              <w:spacing w:after="40" w:line="260"/>
+            </w:pPr>
+            <w:r>
+              <w:rPr>
+                <w:rFonts w:ascii="Arial" w:cs="Arial" w:eastAsia="Arial" w:hAnsi="Arial"/>
+                <w:b/>
+                <w:bCs/>
+                <w:color w:val="3F5650"/>
+                <w:sz w:val="19"/>
+                <w:szCs w:val="19"/>
+              </w:rPr>
+              <w:t xml:space="preserve">Scenariusz</w:t>
+            </w:r>
+          </w:p>
+        </w:tc>
+        <w:tc>
+          <w:tcPr>
+            <w:tcW w:type="dxa" w:w="3600"/>
+            <w:shd w:fill="E6EAE8" w:color="auto" w:val="clear"/>
+            <w:tcMar>
+              <w:top w:type="dxa" w:w="70"/>
+              <w:left w:type="dxa" w:w="100"/>
+              <w:bottom w:type="dxa" w:w="70"/>
+              <w:right w:type="dxa" w:w="100"/>
+            </w:tcMar>
+          </w:tcPr>
+          <w:p>
+            <w:pPr>
+              <w:spacing w:after="40" w:line="260"/>
+            </w:pPr>
+            <w:r>
+              <w:rPr>
+                <w:rFonts w:ascii="Arial" w:cs="Arial" w:eastAsia="Arial" w:hAnsi="Arial"/>
+                <w:b/>
+                <w:bCs/>
+                <w:color w:val="3F5650"/>
+                <w:sz w:val="19"/>
+                <w:szCs w:val="19"/>
+              </w:rPr>
+              <w:t xml:space="preserve">Co zrobić</w:t>
+            </w:r>
+          </w:p>
+        </w:tc>
+        <w:tc>
+          <w:tcPr>
+            <w:tcW w:type="dxa" w:w="3518"/>
+            <w:shd w:fill="E6EAE8" w:color="auto" w:val="clear"/>
+            <w:tcMar>
+              <w:top w:type="dxa" w:w="70"/>
+              <w:left w:type="dxa" w:w="100"/>
+              <w:bottom w:type="dxa" w:w="70"/>
+              <w:right w:type="dxa" w:w="100"/>
+            </w:tcMar>
+          </w:tcPr>
+          <w:p>
+            <w:pPr>
+              <w:spacing w:after="40" w:line="260"/>
+            </w:pPr>
+            <w:r>
+              <w:rPr>
+                <w:rFonts w:ascii="Arial" w:cs="Arial" w:eastAsia="Arial" w:hAnsi="Arial"/>
+                <w:b/>
+                <w:bCs/>
+                <w:color w:val="3F5650"/>
+                <w:sz w:val="19"/>
+                <w:szCs w:val="19"/>
+              </w:rPr>
+              <w:t xml:space="preserve">Oczekiwany wynik</w:t>
+            </w:r>
+          </w:p>
+        </w:tc>
+      </w:tr>
+      <w:tr>
+        <w:trPr>
+          <w:cantSplit/>
+        </w:trPr>
+        <w:tc>
+          <w:tcPr>
+            <w:tcW w:type="dxa" w:w="620"/>
+            <w:tcMar>
+              <w:top w:type="dxa" w:w="70"/>
+              <w:left w:type="dxa" w:w="100"/>
+              <w:bottom w:type="dxa" w:w="70"/>
+              <w:right w:type="dxa" w:w="100"/>
+            </w:tcMar>
+          </w:tcPr>
+          <w:p>
+            <w:pPr>
+              <w:spacing w:after="40" w:line="260"/>
+            </w:pPr>
+            <w:r>
+              <w:rPr>
+                <w:rFonts w:ascii="Arial" w:cs="Arial" w:eastAsia="Arial" w:hAnsi="Arial"/>
+                <w:color w:val="1E2422"/>
+                <w:sz w:val="19"/>
+                <w:szCs w:val="19"/>
+              </w:rPr>
               <w:t xml:space="preserve">B1</w:t>
             </w:r>
           </w:p>
@@ -8205,6 +9513,31 @@
           <w:sz w:val="21"/>
           <w:szCs w:val="21"/>
         </w:rPr>
+        <w:t xml:space="preserve">Kod SMS dla rodziny:</w:t>
+      </w:r>
+      <w:r>
+        <w:rPr>
+          <w:rFonts w:ascii="Arial" w:cs="Arial" w:eastAsia="Arial" w:hAnsi="Arial"/>
+          <w:color w:val="1E2422"/>
+          <w:sz w:val="21"/>
+          <w:szCs w:val="21"/>
+        </w:rPr>
+        <w:t xml:space="preserve"> zapytanie trafia do zakładów dopiero po wpisaniu kodu wysłanego na numer z formularza. Na wersji testowej bez klucza SMSAPI kod pokazuje się na ekranie (żółta ramka „Wersja testowa”). Limity: 5 prób, 3 kody na formularz, 3 formularze na numer w godzinie.</w:t>
+      </w:r>
+    </w:p>
+    <w:p>
+      <w:pPr>
+        <w:spacing w:after="120" w:line="300"/>
+      </w:pPr>
+      <w:r>
+        <w:rPr>
+          <w:rFonts w:ascii="Arial" w:cs="Arial" w:eastAsia="Arial" w:hAnsi="Arial"/>
+          <w:b/>
+          <w:bCs/>
+          <w:color w:val="1E2422"/>
+          <w:sz w:val="21"/>
+          <w:szCs w:val="21"/>
+        </w:rPr>
         <w:t xml:space="preserve">SMS z linkiem dla rodziny:</w:t>
       </w:r>
       <w:r>
@@ -8562,7 +9895,7 @@
         <w:pStyle w:val="ListParagraph"/>
         <w:numPr>
           <w:ilvl w:val="0"/>
-          <w:numId w:val="10"/>
+          <w:numId w:val="9"/>
         </w:numPr>
         <w:spacing w:after="90" w:line="290"/>
       </w:pPr>
@@ -8581,7 +9914,7 @@
         <w:pStyle w:val="ListParagraph"/>
         <w:numPr>
           <w:ilvl w:val="0"/>
-          <w:numId w:val="10"/>
+          <w:numId w:val="9"/>
         </w:numPr>
         <w:spacing w:after="90" w:line="290"/>
       </w:pPr>
@@ -8600,7 +9933,7 @@
         <w:pStyle w:val="ListParagraph"/>
         <w:numPr>
           <w:ilvl w:val="0"/>
-          <w:numId w:val="10"/>
+          <w:numId w:val="9"/>
         </w:numPr>
         <w:spacing w:after="90" w:line="290"/>
       </w:pPr>
@@ -8619,7 +9952,7 @@
         <w:pStyle w:val="ListParagraph"/>
         <w:numPr>
           <w:ilvl w:val="0"/>
-          <w:numId w:val="10"/>
+          <w:numId w:val="9"/>
         </w:numPr>
         <w:spacing w:after="90" w:line="290"/>
       </w:pPr>
@@ -8638,7 +9971,7 @@
         <w:pStyle w:val="ListParagraph"/>
         <w:numPr>
           <w:ilvl w:val="0"/>
-          <w:numId w:val="10"/>
+          <w:numId w:val="9"/>
         </w:numPr>
         <w:spacing w:after="90" w:line="290"/>
       </w:pPr>
@@ -9714,26 +11047,6 @@
       </w:rPr>
     </w:lvl>
   </w:abstractNum>
-  <w:abstractNum w:abstractNumId="10" w15:restartNumberingAfterBreak="0">
-    <w:multiLevelType w:val="hybridMultilevel"/>
-    <w:lvl w:ilvl="0" w15:tentative="1">
-      <w:start w:val="1"/>
-      <w:numFmt w:val="decimal"/>
-      <w:lvlText w:val="%1."/>
-      <w:lvlJc w:val="left"/>
-      <w:pPr>
-        <w:ind w:left="400" w:hanging="400"/>
-      </w:pPr>
-      <w:rPr>
-        <w:rFonts w:ascii="Arial" w:cs="Arial" w:eastAsia="Arial" w:hAnsi="Arial"/>
-        <w:b/>
-        <w:bCs/>
-        <w:color w:val="3F5650"/>
-        <w:sz w:val="21"/>
-        <w:szCs w:val="21"/>
-      </w:rPr>
-    </w:lvl>
-  </w:abstractNum>
   <w:num w:numId="1">
     <w:abstractNumId w:val="1"/>
     <w:lvlOverride w:ilvl="0">
@@ -9784,12 +11097,6 @@
   </w:num>
   <w:num w:numId="9">
     <w:abstractNumId w:val="9"/>
-    <w:lvlOverride w:ilvl="0">
-      <w:startOverride w:val="1"/>
-    </w:lvlOverride>
-  </w:num>
-  <w:num w:numId="10">
-    <w:abstractNumId w:val="10"/>
     <w:lvlOverride w:ilvl="0">
       <w:startOverride w:val="1"/>
     </w:lvlOverride>

</xml_diff>